<commit_message>
Apache Junction cover letter: remove the community events sentence
Co-Authored-By: Claude Opus 5.5 <noreply@anthropic.com>
Claude-Session: https://claude.ai/code/session_01VpCXqDFSAKkK8y6mKL2HCw
</commit_message>
<xml_diff>
--- a/Job Hunt 2026/2026-10-23 - City of Apache Junction - Multimedia Specialist/Joshua_Chappell_CoverLetter_CityOfApacheJunction.docx
+++ b/Job Hunt 2026/2026-10-23 - City of Apache Junction - Multimedia Specialist/Joshua_Chappell_CoverLetter_CityOfApacheJunction.docx
@@ -27,7 +27,7 @@
         </w:rPr>
         <w:t xml:space="preserve">Mesa, AZ • 480-586-7959 • </w:t>
       </w:r>
-      <w:hyperlink w:history="1" r:id="rIdv2_erk08svyywmpux5bap">
+      <w:hyperlink w:history="1" r:id="rIdtbwive_dxo5ajqccd2g-3">
         <w:r>
           <w:rPr>
             <w:rFonts w:ascii="Calibri" w:cs="Calibri" w:eastAsia="Calibri" w:hAnsi="Calibri"/>
@@ -47,7 +47,7 @@
         </w:rPr>
         <w:t xml:space="preserve"> • </w:t>
       </w:r>
-      <w:hyperlink w:history="1" r:id="rIdkbtl2qze8qwvhkwphnqkj">
+      <w:hyperlink w:history="1" r:id="rIdz6doyev7jkeqmlcxeggi3">
         <w:r>
           <w:rPr>
             <w:rFonts w:ascii="Calibri" w:cs="Calibri" w:eastAsia="Calibri" w:hAnsi="Calibri"/>
@@ -67,7 +67,7 @@
         </w:rPr>
         <w:t xml:space="preserve"> • </w:t>
       </w:r>
-      <w:hyperlink w:history="1" r:id="rIdva8iw-uuthxk6nkgs5r8c">
+      <w:hyperlink w:history="1" r:id="rIdqzblxvgbxadvvmbdbmmxm">
         <w:r>
           <w:rPr>
             <w:rFonts w:ascii="Calibri" w:cs="Calibri" w:eastAsia="Calibri" w:hAnsi="Calibri"/>
@@ -87,7 +87,7 @@
         </w:rPr>
         <w:t xml:space="preserve"> • </w:t>
       </w:r>
-      <w:hyperlink w:history="1" r:id="rIdygbsyr_kjhrkra7w23kzz">
+      <w:hyperlink w:history="1" r:id="rIdj1vhy2_nmpueplqimc7rr">
         <w:r>
           <w:rPr>
             <w:rFonts w:ascii="Calibri" w:cs="Calibri" w:eastAsia="Calibri" w:hAnsi="Calibri"/>
@@ -152,7 +152,7 @@
           <w:sz w:val="22"/>
           <w:szCs w:val="22"/>
         </w:rPr>
-        <w:t xml:space="preserve">The role covers equipment upkeep, budgets, and community outreach. I maximized over $1 million of in-house film gear at Grand Canyon Education and stewarded a $30k inventory of photo equipment as a photography teacher. As owner of Lightbox Digital, I delivered 98% of projects on time and 92% within budget. I organize and run community events with my local church congregation, and I orchestrated a community art gallery night showcasing student photos.</w:t>
+        <w:t xml:space="preserve">The role covers equipment upkeep and budgets. I maximized over $1 million of in-house film gear at Grand Canyon Education and stewarded a $30k inventory of photo equipment as a photography teacher. As owner of Lightbox Digital, I delivered 98% of projects on time and 92% within budget.</w:t>
       </w:r>
     </w:p>
     <w:p>

</xml_diff>

<commit_message>
Apache Junction cover letter: no header; builder option cover_letter.header=false
Co-Authored-By: Claude Opus 5.5 <noreply@anthropic.com>
Claude-Session: https://claude.ai/code/session_01VpCXqDFSAKkK8y6mKL2HCw
</commit_message>
<xml_diff>
--- a/Job Hunt 2026/2026-10-23 - City of Apache Junction - Multimedia Specialist/Joshua_Chappell_CoverLetter_CityOfApacheJunction.docx
+++ b/Job Hunt 2026/2026-10-23 - City of Apache Junction - Multimedia Specialist/Joshua_Chappell_CoverLetter_CityOfApacheJunction.docx
@@ -2,103 +2,6 @@
 <file path=word/document.xml><?xml version="1.0" encoding="utf-8"?>
 <w:document xmlns:wpc="http://schemas.microsoft.com/office/word/2010/wordprocessingCanvas" xmlns:mc="http://schemas.openxmlformats.org/markup-compatibility/2006" xmlns:o="urn:schemas-microsoft-com:office:office" xmlns:r="http://schemas.openxmlformats.org/officeDocument/2006/relationships" xmlns:m="http://schemas.openxmlformats.org/officeDocument/2006/math" xmlns:v="urn:schemas-microsoft-com:vml" xmlns:wp14="http://schemas.microsoft.com/office/word/2010/wordprocessingDrawing" xmlns:wp="http://schemas.openxmlformats.org/drawingml/2006/wordprocessingDrawing" xmlns:w10="urn:schemas-microsoft-com:office:word" xmlns:w="http://schemas.openxmlformats.org/wordprocessingml/2006/main" xmlns:w14="http://schemas.microsoft.com/office/word/2010/wordml" xmlns:w15="http://schemas.microsoft.com/office/word/2012/wordml" xmlns:wpg="http://schemas.microsoft.com/office/word/2010/wordprocessingGroup" xmlns:wpi="http://schemas.microsoft.com/office/word/2010/wordprocessingInk" xmlns:wne="http://schemas.microsoft.com/office/word/2006/wordml" xmlns:wps="http://schemas.microsoft.com/office/word/2010/wordprocessingShape" xmlns:cx="http://schemas.microsoft.com/office/drawing/2014/chartex" xmlns:cx1="http://schemas.microsoft.com/office/drawing/2015/9/8/chartex" xmlns:cx2="http://schemas.microsoft.com/office/drawing/2015/10/21/chartex" xmlns:cx3="http://schemas.microsoft.com/office/drawing/2016/5/9/chartex" xmlns:cx4="http://schemas.microsoft.com/office/drawing/2016/5/10/chartex" xmlns:cx5="http://schemas.microsoft.com/office/drawing/2016/5/11/chartex" xmlns:cx6="http://schemas.microsoft.com/office/drawing/2016/5/12/chartex" xmlns:cx7="http://schemas.microsoft.com/office/drawing/2016/5/13/chartex" xmlns:cx8="http://schemas.microsoft.com/office/drawing/2016/5/14/chartex" xmlns:aink="http://schemas.microsoft.com/office/drawing/2016/ink" xmlns:am3d="http://schemas.microsoft.com/office/drawing/2017/model3d" xmlns:w16cex="http://schemas.microsoft.com/office/word/2018/wordml/cex" xmlns:w16cid="http://schemas.microsoft.com/office/word/2016/wordml/cid" xmlns:w16="http://schemas.microsoft.com/office/word/2018/wordml" xmlns:w16sdtdh="http://schemas.microsoft.com/office/word/2020/wordml/sdtdatahash" xmlns:w16se="http://schemas.microsoft.com/office/word/2015/wordml/symex" mc:Ignorable="w14 w15 wp14">
   <w:body>
-    <w:p>
-      <w:r>
-        <w:rPr>
-          <w:rFonts w:ascii="Calibri" w:cs="Calibri" w:eastAsia="Calibri" w:hAnsi="Calibri"/>
-          <w:b/>
-          <w:bCs/>
-          <w:sz w:val="30"/>
-          <w:szCs w:val="30"/>
-        </w:rPr>
-        <w:t xml:space="preserve">Joshua Chappell</w:t>
-      </w:r>
-    </w:p>
-    <w:p>
-      <w:pPr>
-        <w:spacing w:after="400"/>
-      </w:pPr>
-      <w:r>
-        <w:rPr>
-          <w:rFonts w:ascii="Calibri" w:cs="Calibri" w:eastAsia="Calibri" w:hAnsi="Calibri"/>
-          <w:color w:val="444444"/>
-          <w:sz w:val="19"/>
-          <w:szCs w:val="19"/>
-        </w:rPr>
-        <w:t xml:space="preserve">Mesa, AZ • 480-586-7959 • </w:t>
-      </w:r>
-      <w:hyperlink w:history="1" r:id="rIdtbwive_dxo5ajqccd2g-3">
-        <w:r>
-          <w:rPr>
-            <w:rFonts w:ascii="Calibri" w:cs="Calibri" w:eastAsia="Calibri" w:hAnsi="Calibri"/>
-            <w:color w:val="1A4D8F"/>
-            <w:sz w:val="19"/>
-            <w:szCs w:val="19"/>
-          </w:rPr>
-          <w:t xml:space="preserve">jchappellmedia@gmail.com</w:t>
-        </w:r>
-      </w:hyperlink>
-      <w:r>
-        <w:rPr>
-          <w:rFonts w:ascii="Calibri" w:cs="Calibri" w:eastAsia="Calibri" w:hAnsi="Calibri"/>
-          <w:color w:val="444444"/>
-          <w:sz w:val="19"/>
-          <w:szCs w:val="19"/>
-        </w:rPr>
-        <w:t xml:space="preserve"> • </w:t>
-      </w:r>
-      <w:hyperlink w:history="1" r:id="rIdz6doyev7jkeqmlcxeggi3">
-        <w:r>
-          <w:rPr>
-            <w:rFonts w:ascii="Calibri" w:cs="Calibri" w:eastAsia="Calibri" w:hAnsi="Calibri"/>
-            <w:color w:val="1A4D8F"/>
-            <w:sz w:val="19"/>
-            <w:szCs w:val="19"/>
-          </w:rPr>
-          <w:t xml:space="preserve">Demo Reel</w:t>
-        </w:r>
-      </w:hyperlink>
-      <w:r>
-        <w:rPr>
-          <w:rFonts w:ascii="Calibri" w:cs="Calibri" w:eastAsia="Calibri" w:hAnsi="Calibri"/>
-          <w:color w:val="444444"/>
-          <w:sz w:val="19"/>
-          <w:szCs w:val="19"/>
-        </w:rPr>
-        <w:t xml:space="preserve"> • </w:t>
-      </w:r>
-      <w:hyperlink w:history="1" r:id="rIdqzblxvgbxadvvmbdbmmxm">
-        <w:r>
-          <w:rPr>
-            <w:rFonts w:ascii="Calibri" w:cs="Calibri" w:eastAsia="Calibri" w:hAnsi="Calibri"/>
-            <w:color w:val="1A4D8F"/>
-            <w:sz w:val="19"/>
-            <w:szCs w:val="19"/>
-          </w:rPr>
-          <w:t xml:space="preserve">Legislature Video</w:t>
-        </w:r>
-      </w:hyperlink>
-      <w:r>
-        <w:rPr>
-          <w:rFonts w:ascii="Calibri" w:cs="Calibri" w:eastAsia="Calibri" w:hAnsi="Calibri"/>
-          <w:color w:val="444444"/>
-          <w:sz w:val="19"/>
-          <w:szCs w:val="19"/>
-        </w:rPr>
-        <w:t xml:space="preserve"> • </w:t>
-      </w:r>
-      <w:hyperlink w:history="1" r:id="rIdj1vhy2_nmpueplqimc7rr">
-        <w:r>
-          <w:rPr>
-            <w:rFonts w:ascii="Calibri" w:cs="Calibri" w:eastAsia="Calibri" w:hAnsi="Calibri"/>
-            <w:color w:val="1A4D8F"/>
-            <w:sz w:val="19"/>
-            <w:szCs w:val="19"/>
-          </w:rPr>
-          <w:t xml:space="preserve">LinkedIn</w:t>
-        </w:r>
-      </w:hyperlink>
-    </w:p>
     <w:p>
       <w:pPr>
         <w:spacing w:after="220" w:line="276"/>

</xml_diff>